<commit_message>
Actualiza EstructuraMicroservicios_EPS.docx con descripcion completa
</commit_message>
<xml_diff>
--- a/EstructuraMicroservicios_EPS.docx
+++ b/EstructuraMicroservicios_EPS.docx
@@ -2,11 +2,1514 @@
 <file path=word/document.xml><?xml version="1.0" encoding="utf-8"?>
 <w:document xmlns:wpc="http://schemas.microsoft.com/office/word/2010/wordprocessingCanvas" xmlns:cx="http://schemas.microsoft.com/office/drawing/2014/chartex" xmlns:cx1="http://schemas.microsoft.com/office/drawing/2015/9/8/chartex" xmlns:cx2="http://schemas.microsoft.com/office/drawing/2015/10/21/chartex" xmlns:cx3="http://schemas.microsoft.com/office/drawing/2016/5/9/chartex" xmlns:cx4="http://schemas.microsoft.com/office/drawing/2016/5/10/chartex" xmlns:cx5="http://schemas.microsoft.com/office/drawing/2016/5/11/chartex" xmlns:cx6="http://schemas.microsoft.com/office/drawing/2016/5/12/chartex" xmlns:cx7="http://schemas.microsoft.com/office/drawing/2016/5/13/chartex" xmlns:cx8="http://schemas.microsoft.com/office/drawing/2016/5/14/chartex" xmlns:mc="http://schemas.openxmlformats.org/markup-compatibility/2006" xmlns:aink="http://schemas.microsoft.com/office/drawing/2016/ink" xmlns:am3d="http://schemas.microsoft.com/office/drawing/2017/model3d" xmlns:o="urn:schemas-microsoft-com:office:office" xmlns:oel="http://schemas.microsoft.com/office/2019/extlst" xmlns:r="http://schemas.openxmlformats.org/officeDocument/2006/relationships" xmlns:m="http://schemas.openxmlformats.org/officeDocument/2006/math" xmlns:v="urn:schemas-microsoft-com:vml" xmlns:wp14="http://schemas.microsoft.com/office/word/2010/wordprocessingDrawing" xmlns:wp="http://schemas.openxmlformats.org/drawingml/2006/wordprocessingDrawing" xmlns:w10="urn:schemas-microsoft-com:office:word" xmlns:w="http://schemas.openxmlformats.org/wordprocessingml/2006/main" xmlns:w14="http://schemas.microsoft.com/office/word/2010/wordml" xmlns:w15="http://schemas.microsoft.com/office/word/2012/wordml" xmlns:w16cex="http://schemas.microsoft.com/office/word/2018/wordml/cex" xmlns:w16cid="http://schemas.microsoft.com/office/word/2016/wordml/cid" xmlns:w16="http://schemas.microsoft.com/office/word/2018/wordml" xmlns:w16du="http://schemas.microsoft.com/office/word/2023/wordml/word16du" xmlns:w16sdtdh="http://schemas.microsoft.com/office/word/2020/wordml/sdtdatahash" xmlns:w16sdtfl="http://schemas.microsoft.com/office/word/2024/wordml/sdtformatlock" xmlns:w16se="http://schemas.microsoft.com/office/word/2015/wordml/symex" xmlns:wpg="http://schemas.microsoft.com/office/word/2010/wordprocessingGroup" xmlns:wpi="http://schemas.microsoft.com/office/word/2010/wordprocessingInk" xmlns:wne="http://schemas.microsoft.com/office/word/2006/wordml" xmlns:wps="http://schemas.microsoft.com/office/word/2010/wordprocessingShape" mc:Ignorable="w14 w15 w16se w16cid w16 w16cex w16sdtdh w16sdtfl w16du wp14">
   <w:body>
+    <w:p>
+      <w:pPr>
+        <w:spacing w:after="60"/>
+        <w:jc w:val="center"/>
+      </w:pPr>
+      <w:r>
+        <w:rPr>
+          <w:b/>
+          <w:bCs/>
+          <w:sz w:val="32"/>
+          <w:szCs w:val="32"/>
+        </w:rPr>
+        <w:t>ESTRUCTURA DE MICROSERVICIOS</w:t>
+      </w:r>
+    </w:p>
+    <w:p>
+      <w:pPr>
+        <w:spacing w:after="300"/>
+        <w:jc w:val="center"/>
+      </w:pPr>
+      <w:r>
+        <w:rPr>
+          <w:i/>
+          <w:iCs/>
+          <w:sz w:val="22"/>
+          <w:szCs w:val="22"/>
+        </w:rPr>
+        <w:t>Sistema de información de una EPS (Entidad Promotora de Salud)</w:t>
+      </w:r>
+    </w:p>
+    <w:tbl>
+      <w:tblPr>
+        <w:tblW w:w="5000" w:type="pct"/>
+        <w:tblBorders>
+          <w:top w:val="single" w:sz="4" w:space="0" w:color="auto"/>
+          <w:left w:val="single" w:sz="4" w:space="0" w:color="auto"/>
+          <w:bottom w:val="single" w:sz="4" w:space="0" w:color="auto"/>
+          <w:right w:val="single" w:sz="4" w:space="0" w:color="auto"/>
+          <w:insideH w:val="single" w:sz="4" w:space="0" w:color="auto"/>
+          <w:insideV w:val="single" w:sz="4" w:space="0" w:color="auto"/>
+        </w:tblBorders>
+        <w:tblCellMar>
+          <w:left w:w="10" w:type="dxa"/>
+          <w:right w:w="10" w:type="dxa"/>
+        </w:tblCellMar>
+        <w:tblLook w:val="0000" w:firstRow="0" w:lastRow="0" w:firstColumn="0" w:lastColumn="0" w:noHBand="0" w:noVBand="0"/>
+      </w:tblPr>
+      <w:tblGrid>
+        <w:gridCol w:w="2960"/>
+        <w:gridCol w:w="6390"/>
+      </w:tblGrid>
+      <w:tr>
+        <w:tc>
+          <w:tcPr>
+            <w:tcW w:w="3000" w:type="dxa"/>
+            <w:shd w:val="clear" w:color="auto" w:fill="F2F2F2"/>
+          </w:tcPr>
+          <w:p>
+            <w:r>
+              <w:rPr>
+                <w:b/>
+                <w:bCs/>
+              </w:rPr>
+              <w:t>Asignatura:</w:t>
+            </w:r>
+          </w:p>
+        </w:tc>
+        <w:tc>
+          <w:tcPr>
+            <w:tcW w:w="6500" w:type="dxa"/>
+          </w:tcPr>
+          <w:p>
+            <w:r>
+              <w:t>Ingeniería de Software III (FI303290)</w:t>
+            </w:r>
+          </w:p>
+        </w:tc>
+      </w:tr>
+      <w:tr>
+        <w:tc>
+          <w:tcPr>
+            <w:tcW w:w="3000" w:type="dxa"/>
+            <w:shd w:val="clear" w:color="auto" w:fill="F2F2F2"/>
+          </w:tcPr>
+          <w:p>
+            <w:r>
+              <w:rPr>
+                <w:b/>
+                <w:bCs/>
+              </w:rPr>
+              <w:t>Taller:</w:t>
+            </w:r>
+          </w:p>
+        </w:tc>
+        <w:tc>
+          <w:tcPr>
+            <w:tcW w:w="6500" w:type="dxa"/>
+          </w:tcPr>
+          <w:p>
+            <w:r>
+              <w:t>Control de versiones con Git y GitHub</w:t>
+            </w:r>
+          </w:p>
+        </w:tc>
+      </w:tr>
+      <w:tr>
+        <w:tc>
+          <w:tcPr>
+            <w:tcW w:w="3000" w:type="dxa"/>
+            <w:shd w:val="clear" w:color="auto" w:fill="F2F2F2"/>
+          </w:tcPr>
+          <w:p>
+            <w:r>
+              <w:rPr>
+                <w:b/>
+                <w:bCs/>
+              </w:rPr>
+              <w:t>Estudiante:</w:t>
+            </w:r>
+          </w:p>
+        </w:tc>
+        <w:tc>
+          <w:tcPr>
+            <w:tcW w:w="6500" w:type="dxa"/>
+          </w:tcPr>
+          <w:p>
+            <w:r>
+              <w:t xml:space="preserve">Karen Muelas Aranda </w:t>
+            </w:r>
+          </w:p>
+        </w:tc>
+      </w:tr>
+      <w:tr>
+        <w:tc>
+          <w:tcPr>
+            <w:tcW w:w="3000" w:type="dxa"/>
+            <w:shd w:val="clear" w:color="auto" w:fill="F2F2F2"/>
+          </w:tcPr>
+          <w:p>
+            <w:r>
+              <w:rPr>
+                <w:b/>
+                <w:bCs/>
+              </w:rPr>
+              <w:t>Usuario de GitHub:</w:t>
+            </w:r>
+          </w:p>
+        </w:tc>
+        <w:tc>
+          <w:tcPr>
+            <w:tcW w:w="6500" w:type="dxa"/>
+          </w:tcPr>
+          <w:p>
+            <w:r>
+              <w:t>KYMUELAS</w:t>
+            </w:r>
+          </w:p>
+        </w:tc>
+      </w:tr>
+      <w:tr>
+        <w:tc>
+          <w:tcPr>
+            <w:tcW w:w="3000" w:type="dxa"/>
+            <w:shd w:val="clear" w:color="auto" w:fill="F2F2F2"/>
+          </w:tcPr>
+          <w:p>
+            <w:r>
+              <w:rPr>
+                <w:b/>
+                <w:bCs/>
+              </w:rPr>
+              <w:t>Repositorio:</w:t>
+            </w:r>
+          </w:p>
+        </w:tc>
+        <w:tc>
+          <w:tcPr>
+            <w:tcW w:w="6500" w:type="dxa"/>
+          </w:tcPr>
+          <w:p>
+            <w:proofErr w:type="spellStart"/>
+            <w:r>
+              <w:t>evaluacionGit</w:t>
+            </w:r>
+            <w:proofErr w:type="spellEnd"/>
+            <w:r>
+              <w:t>-</w:t>
+            </w:r>
+          </w:p>
+        </w:tc>
+      </w:tr>
+    </w:tbl>
+    <w:p>
+      <w:pPr>
+        <w:spacing w:after="300"/>
+      </w:pPr>
+    </w:p>
+    <w:p>
+      <w:pPr>
+        <w:pStyle w:val="Ttulo1"/>
+        <w:spacing w:before="300" w:after="150"/>
+      </w:pPr>
+      <w:r>
+        <w:t>1. Propósito de este documento</w:t>
+      </w:r>
+    </w:p>
+    <w:p>
+      <w:pPr>
+        <w:spacing w:after="120"/>
+      </w:pPr>
+      <w:r>
+        <w:t xml:space="preserve">Este documento describe el esqueleto inicial de microservicios definido para el sistema de información de una EPS, tal como fue creado en la rama </w:t>
+      </w:r>
+      <w:proofErr w:type="spellStart"/>
+      <w:r>
+        <w:t>main</w:t>
+      </w:r>
+      <w:proofErr w:type="spellEnd"/>
+      <w:r>
+        <w:t xml:space="preserve"> del repositorio </w:t>
+      </w:r>
+      <w:proofErr w:type="spellStart"/>
+      <w:r>
+        <w:t>evaluacionGit</w:t>
+      </w:r>
+      <w:proofErr w:type="spellEnd"/>
+      <w:r>
+        <w:t>-. En esta etapa cada microservicio existe únicamente como una carpeta con un archivo mínimo (index.js), sin lógica de negocio implementada; su propósito es dejar establecida la división de responsabilidades del sistema antes de avanzar en el desarrollo.</w:t>
+      </w:r>
+    </w:p>
+    <w:p>
+      <w:pPr>
+        <w:spacing w:after="120"/>
+      </w:pPr>
+      <w:r>
+        <w:t xml:space="preserve">La explicación detallada de la arquitectura (comunicación entre servicios, patrones aplicados y diagrama) se encuentra por separado en </w:t>
+      </w:r>
+      <w:proofErr w:type="spellStart"/>
+      <w:r>
+        <w:t>Docs</w:t>
+      </w:r>
+      <w:proofErr w:type="spellEnd"/>
+      <w:r>
+        <w:t>/Arquitectura_EPS.docx, disponible únicamente en la rama desarrollo.</w:t>
+      </w:r>
+    </w:p>
+    <w:p>
+      <w:pPr>
+        <w:pStyle w:val="Ttulo1"/>
+        <w:spacing w:before="300" w:after="150"/>
+      </w:pPr>
+      <w:r>
+        <w:t>2. Estructura de carpetas creada</w:t>
+      </w:r>
+    </w:p>
+    <w:p>
+      <w:pPr>
+        <w:spacing w:after="120"/>
+      </w:pPr>
+      <w:r>
+        <w:t xml:space="preserve">Dentro de la carpeta </w:t>
+      </w:r>
+      <w:proofErr w:type="spellStart"/>
+      <w:r>
+        <w:t>eps</w:t>
+      </w:r>
+      <w:proofErr w:type="spellEnd"/>
+      <w:r>
+        <w:t>-microservicios/ se crearon las siguientes carpetas, una por cada microservicio identificado:</w:t>
+      </w:r>
+    </w:p>
+    <w:p>
+      <w:proofErr w:type="spellStart"/>
+      <w:r>
+        <w:rPr>
+          <w:rFonts w:ascii="Consolas" w:eastAsia="Consolas" w:hAnsi="Consolas" w:cs="Consolas"/>
+        </w:rPr>
+        <w:t>eps</w:t>
+      </w:r>
+      <w:proofErr w:type="spellEnd"/>
+      <w:r>
+        <w:rPr>
+          <w:rFonts w:ascii="Consolas" w:eastAsia="Consolas" w:hAnsi="Consolas" w:cs="Consolas"/>
+        </w:rPr>
+        <w:t>-microservicios/</w:t>
+      </w:r>
+    </w:p>
+    <w:p>
+      <w:r>
+        <w:rPr>
+          <w:rFonts w:ascii="Consolas" w:eastAsia="Consolas" w:hAnsi="Consolas" w:cs="Consolas"/>
+        </w:rPr>
+        <w:t>├── api-</w:t>
+      </w:r>
+      <w:proofErr w:type="spellStart"/>
+      <w:r>
+        <w:rPr>
+          <w:rFonts w:ascii="Consolas" w:eastAsia="Consolas" w:hAnsi="Consolas" w:cs="Consolas"/>
+        </w:rPr>
+        <w:t>gateway</w:t>
+      </w:r>
+      <w:proofErr w:type="spellEnd"/>
+      <w:r>
+        <w:rPr>
+          <w:rFonts w:ascii="Consolas" w:eastAsia="Consolas" w:hAnsi="Consolas" w:cs="Consolas"/>
+        </w:rPr>
+        <w:t>/</w:t>
+      </w:r>
+    </w:p>
+    <w:p>
+      <w:r>
+        <w:rPr>
+          <w:rFonts w:ascii="Consolas" w:eastAsia="Consolas" w:hAnsi="Consolas" w:cs="Consolas"/>
+        </w:rPr>
+        <w:t>├── microservicio-afiliaciones/</w:t>
+      </w:r>
+    </w:p>
+    <w:p>
+      <w:r>
+        <w:rPr>
+          <w:rFonts w:ascii="Consolas" w:eastAsia="Consolas" w:hAnsi="Consolas" w:cs="Consolas"/>
+        </w:rPr>
+        <w:t>├── microservicio-citas/</w:t>
+      </w:r>
+    </w:p>
+    <w:p>
+      <w:r>
+        <w:rPr>
+          <w:rFonts w:ascii="Consolas" w:eastAsia="Consolas" w:hAnsi="Consolas" w:cs="Consolas"/>
+        </w:rPr>
+        <w:t>├── microservicio-autorizaciones/</w:t>
+      </w:r>
+    </w:p>
+    <w:p>
+      <w:r>
+        <w:rPr>
+          <w:rFonts w:ascii="Consolas" w:eastAsia="Consolas" w:hAnsi="Consolas" w:cs="Consolas"/>
+        </w:rPr>
+        <w:t>├── microservicio-</w:t>
+      </w:r>
+      <w:proofErr w:type="spellStart"/>
+      <w:r>
+        <w:rPr>
+          <w:rFonts w:ascii="Consolas" w:eastAsia="Consolas" w:hAnsi="Consolas" w:cs="Consolas"/>
+        </w:rPr>
+        <w:t>facturacion</w:t>
+      </w:r>
+      <w:proofErr w:type="spellEnd"/>
+      <w:r>
+        <w:rPr>
+          <w:rFonts w:ascii="Consolas" w:eastAsia="Consolas" w:hAnsi="Consolas" w:cs="Consolas"/>
+        </w:rPr>
+        <w:t>/</w:t>
+      </w:r>
+    </w:p>
+    <w:p>
+      <w:r>
+        <w:rPr>
+          <w:rFonts w:ascii="Consolas" w:eastAsia="Consolas" w:hAnsi="Consolas" w:cs="Consolas"/>
+        </w:rPr>
+        <w:t>└── microservicio-historias-</w:t>
+      </w:r>
+      <w:proofErr w:type="spellStart"/>
+      <w:r>
+        <w:rPr>
+          <w:rFonts w:ascii="Consolas" w:eastAsia="Consolas" w:hAnsi="Consolas" w:cs="Consolas"/>
+        </w:rPr>
+        <w:t>clinicas</w:t>
+      </w:r>
+      <w:proofErr w:type="spellEnd"/>
+      <w:r>
+        <w:rPr>
+          <w:rFonts w:ascii="Consolas" w:eastAsia="Consolas" w:hAnsi="Consolas" w:cs="Consolas"/>
+        </w:rPr>
+        <w:t>/</w:t>
+      </w:r>
+    </w:p>
+    <w:p>
+      <w:pPr>
+        <w:spacing w:after="200"/>
+      </w:pPr>
+    </w:p>
+    <w:p>
+      <w:pPr>
+        <w:spacing w:after="120"/>
+      </w:pPr>
+      <w:r>
+        <w:t>Cada una de estas carpetas contiene por ahora un único archivo index.js con una línea de comentario que identifica el microservicio, únicamente para que la carpeta no quede vacía (Git no versiona carpetas vacías).</w:t>
+      </w:r>
+    </w:p>
+    <w:p>
+      <w:pPr>
+        <w:pStyle w:val="Ttulo1"/>
+        <w:spacing w:before="300" w:after="150"/>
+      </w:pPr>
+      <w:r>
+        <w:t>3. Descripción de cada microservicio</w:t>
+      </w:r>
+    </w:p>
+    <w:tbl>
+      <w:tblPr>
+        <w:tblW w:w="5000" w:type="pct"/>
+        <w:tblBorders>
+          <w:top w:val="single" w:sz="4" w:space="0" w:color="auto"/>
+          <w:left w:val="single" w:sz="4" w:space="0" w:color="auto"/>
+          <w:bottom w:val="single" w:sz="4" w:space="0" w:color="auto"/>
+          <w:right w:val="single" w:sz="4" w:space="0" w:color="auto"/>
+          <w:insideH w:val="single" w:sz="4" w:space="0" w:color="auto"/>
+          <w:insideV w:val="single" w:sz="4" w:space="0" w:color="auto"/>
+        </w:tblBorders>
+        <w:tblCellMar>
+          <w:left w:w="10" w:type="dxa"/>
+          <w:right w:w="10" w:type="dxa"/>
+        </w:tblCellMar>
+        <w:tblLook w:val="0000" w:firstRow="0" w:lastRow="0" w:firstColumn="0" w:lastColumn="0" w:noHBand="0" w:noVBand="0"/>
+      </w:tblPr>
+      <w:tblGrid>
+        <w:gridCol w:w="2706"/>
+        <w:gridCol w:w="6644"/>
+      </w:tblGrid>
+      <w:tr>
+        <w:tc>
+          <w:tcPr>
+            <w:tcW w:w="0" w:type="auto"/>
+            <w:shd w:val="clear" w:color="auto" w:fill="1F4E79"/>
+          </w:tcPr>
+          <w:p>
+            <w:r>
+              <w:rPr>
+                <w:b/>
+                <w:bCs/>
+                <w:color w:val="FFFFFF"/>
+              </w:rPr>
+              <w:t>Carpeta / Microservicio</w:t>
+            </w:r>
+          </w:p>
+        </w:tc>
+        <w:tc>
+          <w:tcPr>
+            <w:tcW w:w="0" w:type="auto"/>
+            <w:shd w:val="clear" w:color="auto" w:fill="1F4E79"/>
+          </w:tcPr>
+          <w:p>
+            <w:r>
+              <w:rPr>
+                <w:b/>
+                <w:bCs/>
+                <w:color w:val="FFFFFF"/>
+              </w:rPr>
+              <w:t>Responsabilidad</w:t>
+            </w:r>
+          </w:p>
+        </w:tc>
+      </w:tr>
+      <w:tr>
+        <w:tc>
+          <w:tcPr>
+            <w:tcW w:w="0" w:type="auto"/>
+          </w:tcPr>
+          <w:p>
+            <w:r>
+              <w:rPr>
+                <w:rFonts w:ascii="Consolas" w:eastAsia="Consolas" w:hAnsi="Consolas" w:cs="Consolas"/>
+              </w:rPr>
+              <w:t>api-</w:t>
+            </w:r>
+            <w:proofErr w:type="spellStart"/>
+            <w:r>
+              <w:rPr>
+                <w:rFonts w:ascii="Consolas" w:eastAsia="Consolas" w:hAnsi="Consolas" w:cs="Consolas"/>
+              </w:rPr>
+              <w:t>gateway</w:t>
+            </w:r>
+            <w:proofErr w:type="spellEnd"/>
+          </w:p>
+        </w:tc>
+        <w:tc>
+          <w:tcPr>
+            <w:tcW w:w="0" w:type="auto"/>
+          </w:tcPr>
+          <w:p>
+            <w:r>
+              <w:t>Punto único de entrada del sistema. Enruta cada petición del cliente al microservicio correspondiente y centraliza la autenticación.</w:t>
+            </w:r>
+          </w:p>
+        </w:tc>
+      </w:tr>
+      <w:tr>
+        <w:tc>
+          <w:tcPr>
+            <w:tcW w:w="0" w:type="auto"/>
+          </w:tcPr>
+          <w:p>
+            <w:r>
+              <w:rPr>
+                <w:rFonts w:ascii="Consolas" w:eastAsia="Consolas" w:hAnsi="Consolas" w:cs="Consolas"/>
+              </w:rPr>
+              <w:t>microservicio-afiliaciones</w:t>
+            </w:r>
+          </w:p>
+        </w:tc>
+        <w:tc>
+          <w:tcPr>
+            <w:tcW w:w="0" w:type="auto"/>
+          </w:tcPr>
+          <w:p>
+            <w:r>
+              <w:t>Administra los datos de afiliación y demográficos de cada paciente de la EPS.</w:t>
+            </w:r>
+          </w:p>
+        </w:tc>
+      </w:tr>
+      <w:tr>
+        <w:tc>
+          <w:tcPr>
+            <w:tcW w:w="0" w:type="auto"/>
+          </w:tcPr>
+          <w:p>
+            <w:r>
+              <w:rPr>
+                <w:rFonts w:ascii="Consolas" w:eastAsia="Consolas" w:hAnsi="Consolas" w:cs="Consolas"/>
+              </w:rPr>
+              <w:t>microservicio-citas</w:t>
+            </w:r>
+          </w:p>
+        </w:tc>
+        <w:tc>
+          <w:tcPr>
+            <w:tcW w:w="0" w:type="auto"/>
+          </w:tcPr>
+          <w:p>
+            <w:r>
+              <w:t>Gestiona el agendamiento, reprogramación y cancelación de citas médicas.</w:t>
+            </w:r>
+          </w:p>
+        </w:tc>
+      </w:tr>
+      <w:tr>
+        <w:tc>
+          <w:tcPr>
+            <w:tcW w:w="0" w:type="auto"/>
+          </w:tcPr>
+          <w:p>
+            <w:r>
+              <w:rPr>
+                <w:rFonts w:ascii="Consolas" w:eastAsia="Consolas" w:hAnsi="Consolas" w:cs="Consolas"/>
+              </w:rPr>
+              <w:t>microservicio-autorizaciones</w:t>
+            </w:r>
+          </w:p>
+        </w:tc>
+        <w:tc>
+          <w:tcPr>
+            <w:tcW w:w="0" w:type="auto"/>
+          </w:tcPr>
+          <w:p>
+            <w:r>
+              <w:t>Evalúa y emite autorizaciones de procedimientos y servicios médicos según el plan del afiliado.</w:t>
+            </w:r>
+          </w:p>
+        </w:tc>
+      </w:tr>
+      <w:tr>
+        <w:tc>
+          <w:tcPr>
+            <w:tcW w:w="0" w:type="auto"/>
+          </w:tcPr>
+          <w:p>
+            <w:r>
+              <w:rPr>
+                <w:rFonts w:ascii="Consolas" w:eastAsia="Consolas" w:hAnsi="Consolas" w:cs="Consolas"/>
+              </w:rPr>
+              <w:t>microservicio-</w:t>
+            </w:r>
+            <w:proofErr w:type="spellStart"/>
+            <w:r>
+              <w:rPr>
+                <w:rFonts w:ascii="Consolas" w:eastAsia="Consolas" w:hAnsi="Consolas" w:cs="Consolas"/>
+              </w:rPr>
+              <w:t>facturacion</w:t>
+            </w:r>
+            <w:proofErr w:type="spellEnd"/>
+          </w:p>
+        </w:tc>
+        <w:tc>
+          <w:tcPr>
+            <w:tcW w:w="0" w:type="auto"/>
+          </w:tcPr>
+          <w:p>
+            <w:r>
+              <w:t>Procesa cobros, copagos y liquidaciones asociadas a los servicios prestados.</w:t>
+            </w:r>
+          </w:p>
+        </w:tc>
+      </w:tr>
+      <w:tr>
+        <w:tc>
+          <w:tcPr>
+            <w:tcW w:w="0" w:type="auto"/>
+          </w:tcPr>
+          <w:p>
+            <w:r>
+              <w:rPr>
+                <w:rFonts w:ascii="Consolas" w:eastAsia="Consolas" w:hAnsi="Consolas" w:cs="Consolas"/>
+              </w:rPr>
+              <w:t>microservicio-historias-</w:t>
+            </w:r>
+            <w:proofErr w:type="spellStart"/>
+            <w:r>
+              <w:rPr>
+                <w:rFonts w:ascii="Consolas" w:eastAsia="Consolas" w:hAnsi="Consolas" w:cs="Consolas"/>
+              </w:rPr>
+              <w:t>clinicas</w:t>
+            </w:r>
+            <w:proofErr w:type="spellEnd"/>
+          </w:p>
+        </w:tc>
+        <w:tc>
+          <w:tcPr>
+            <w:tcW w:w="0" w:type="auto"/>
+          </w:tcPr>
+          <w:p>
+            <w:r>
+              <w:t>Registra diagnósticos, tratamientos y evolución médica de cada paciente.</w:t>
+            </w:r>
+          </w:p>
+        </w:tc>
+      </w:tr>
+    </w:tbl>
+    <w:p>
+      <w:pPr>
+        <w:spacing w:after="200"/>
+      </w:pPr>
+    </w:p>
+    <w:p>
+      <w:pPr>
+        <w:pStyle w:val="Ttulo1"/>
+        <w:spacing w:before="300" w:after="150"/>
+      </w:pPr>
+      <w:r>
+        <w:t>4. Justificación de la división</w:t>
+      </w:r>
+    </w:p>
+    <w:p>
+      <w:pPr>
+        <w:spacing w:after="120"/>
+      </w:pPr>
+      <w:r>
+        <w:lastRenderedPageBreak/>
+        <w:t>La estructura se dividió en microservicios independientes siguiendo el principio de un dominio de negocio por servicio:</w:t>
+      </w:r>
+    </w:p>
+    <w:p>
+      <w:pPr>
+        <w:pStyle w:val="Prrafodelista"/>
+        <w:numPr>
+          <w:ilvl w:val="0"/>
+          <w:numId w:val="3"/>
+        </w:numPr>
+        <w:spacing w:after="60"/>
+        <w:contextualSpacing w:val="0"/>
+      </w:pPr>
+      <w:r>
+        <w:t>Cada microservicio agrupa una responsabilidad concreta de la EPS (afiliaciones, citas, autorizaciones, facturación, historias clínicas), evitando construir una única aplicación monolítica.</w:t>
+      </w:r>
+    </w:p>
+    <w:p>
+      <w:pPr>
+        <w:pStyle w:val="Prrafodelista"/>
+        <w:numPr>
+          <w:ilvl w:val="0"/>
+          <w:numId w:val="3"/>
+        </w:numPr>
+        <w:spacing w:after="60"/>
+        <w:contextualSpacing w:val="0"/>
+      </w:pPr>
+      <w:r>
+        <w:t>El api-</w:t>
+      </w:r>
+      <w:proofErr w:type="spellStart"/>
+      <w:r>
+        <w:t>gateway</w:t>
+      </w:r>
+      <w:proofErr w:type="spellEnd"/>
+      <w:r>
+        <w:t xml:space="preserve"> centraliza el punto de entrada, de modo que el cliente no necesita conocer la ubicación de cada microservicio por separado.</w:t>
+      </w:r>
+    </w:p>
+    <w:p>
+      <w:pPr>
+        <w:pStyle w:val="Prrafodelista"/>
+        <w:numPr>
+          <w:ilvl w:val="0"/>
+          <w:numId w:val="3"/>
+        </w:numPr>
+        <w:spacing w:after="60"/>
+        <w:contextualSpacing w:val="0"/>
+      </w:pPr>
+      <w:r>
+        <w:t>Esta separación permite que, en una fase posterior de desarrollo, cada microservicio pueda evolucionar, desplegarse y escalar de forma independiente.</w:t>
+      </w:r>
+    </w:p>
+    <w:p>
+      <w:pPr>
+        <w:pStyle w:val="Ttulo1"/>
+        <w:spacing w:before="300" w:after="150"/>
+      </w:pPr>
+      <w:r>
+        <w:t>5. Estado de esta entrega</w:t>
+      </w:r>
+    </w:p>
+    <w:p>
+      <w:pPr>
+        <w:spacing w:after="120"/>
+      </w:pPr>
+      <w:r>
+        <w:t xml:space="preserve">Esta estructura corresponde a la rama </w:t>
+      </w:r>
+      <w:proofErr w:type="spellStart"/>
+      <w:r>
+        <w:t>main</w:t>
+      </w:r>
+      <w:proofErr w:type="spellEnd"/>
+      <w:r>
+        <w:t xml:space="preserve"> del repositorio y se mantiene igual en las ramas desarrollo y pruebas, ya que representa la base común del proyecto. Lo que varía entre ramas es el contenido adicional (</w:t>
+      </w:r>
+      <w:proofErr w:type="spellStart"/>
+      <w:r>
+        <w:t>Docs</w:t>
+      </w:r>
+      <w:proofErr w:type="spellEnd"/>
+      <w:r>
+        <w:t xml:space="preserve">/ solo en desarrollo; </w:t>
+      </w:r>
+      <w:proofErr w:type="spellStart"/>
+      <w:r>
+        <w:t>Algoritmos_pruebas</w:t>
+      </w:r>
+      <w:proofErr w:type="spellEnd"/>
+      <w:r>
+        <w:t xml:space="preserve">/ en desarrollo y pruebas, no en </w:t>
+      </w:r>
+      <w:proofErr w:type="spellStart"/>
+      <w:r>
+        <w:t>main</w:t>
+      </w:r>
+      <w:proofErr w:type="spellEnd"/>
+      <w:r>
+        <w:t>), conforme a la estructura esperada definida en el taller.</w:t>
+      </w:r>
+    </w:p>
+    <w:p>
+      <w:pPr>
+        <w:spacing w:after="60"/>
+        <w:jc w:val="center"/>
+      </w:pPr>
+      <w:r>
+        <w:rPr>
+          <w:b/>
+          <w:bCs/>
+          <w:sz w:val="32"/>
+          <w:szCs w:val="32"/>
+        </w:rPr>
+        <w:t>ESTRUCTURA DE MICROSERVICIOS</w:t>
+      </w:r>
+    </w:p>
+    <w:p>
+      <w:pPr>
+        <w:spacing w:after="300"/>
+        <w:jc w:val="center"/>
+      </w:pPr>
+      <w:r>
+        <w:rPr>
+          <w:i/>
+          <w:iCs/>
+          <w:sz w:val="22"/>
+          <w:szCs w:val="22"/>
+        </w:rPr>
+        <w:t>Sistema de información de una EPS (Entidad Promotora de Salud)</w:t>
+      </w:r>
+    </w:p>
+    <w:tbl>
+      <w:tblPr>
+        <w:tblW w:w="5000" w:type="pct"/>
+        <w:tblBorders>
+          <w:top w:val="single" w:sz="4" w:space="0" w:color="auto"/>
+          <w:left w:val="single" w:sz="4" w:space="0" w:color="auto"/>
+          <w:bottom w:val="single" w:sz="4" w:space="0" w:color="auto"/>
+          <w:right w:val="single" w:sz="4" w:space="0" w:color="auto"/>
+          <w:insideH w:val="single" w:sz="4" w:space="0" w:color="auto"/>
+          <w:insideV w:val="single" w:sz="4" w:space="0" w:color="auto"/>
+        </w:tblBorders>
+        <w:tblCellMar>
+          <w:left w:w="10" w:type="dxa"/>
+          <w:right w:w="10" w:type="dxa"/>
+        </w:tblCellMar>
+        <w:tblLook w:val="0000" w:firstRow="0" w:lastRow="0" w:firstColumn="0" w:lastColumn="0" w:noHBand="0" w:noVBand="0"/>
+      </w:tblPr>
+      <w:tblGrid>
+        <w:gridCol w:w="2960"/>
+        <w:gridCol w:w="6390"/>
+      </w:tblGrid>
+      <w:tr>
+        <w:tc>
+          <w:tcPr>
+            <w:tcW w:w="3000" w:type="dxa"/>
+            <w:shd w:val="clear" w:color="auto" w:fill="F2F2F2"/>
+          </w:tcPr>
+          <w:p>
+            <w:r>
+              <w:rPr>
+                <w:b/>
+                <w:bCs/>
+              </w:rPr>
+              <w:t>Asignatura:</w:t>
+            </w:r>
+          </w:p>
+        </w:tc>
+        <w:tc>
+          <w:tcPr>
+            <w:tcW w:w="6500" w:type="dxa"/>
+          </w:tcPr>
+          <w:p>
+            <w:r>
+              <w:t>Ingeniería de Software III (FI303290)</w:t>
+            </w:r>
+          </w:p>
+        </w:tc>
+      </w:tr>
+      <w:tr>
+        <w:tc>
+          <w:tcPr>
+            <w:tcW w:w="3000" w:type="dxa"/>
+            <w:shd w:val="clear" w:color="auto" w:fill="F2F2F2"/>
+          </w:tcPr>
+          <w:p>
+            <w:r>
+              <w:rPr>
+                <w:b/>
+                <w:bCs/>
+              </w:rPr>
+              <w:t>Taller:</w:t>
+            </w:r>
+          </w:p>
+        </w:tc>
+        <w:tc>
+          <w:tcPr>
+            <w:tcW w:w="6500" w:type="dxa"/>
+          </w:tcPr>
+          <w:p>
+            <w:r>
+              <w:t>Control de versiones con Git y GitHub</w:t>
+            </w:r>
+          </w:p>
+        </w:tc>
+      </w:tr>
+      <w:tr>
+        <w:tc>
+          <w:tcPr>
+            <w:tcW w:w="3000" w:type="dxa"/>
+            <w:shd w:val="clear" w:color="auto" w:fill="F2F2F2"/>
+          </w:tcPr>
+          <w:p>
+            <w:r>
+              <w:rPr>
+                <w:b/>
+                <w:bCs/>
+              </w:rPr>
+              <w:t>Estudiante:</w:t>
+            </w:r>
+          </w:p>
+        </w:tc>
+        <w:tc>
+          <w:tcPr>
+            <w:tcW w:w="6500" w:type="dxa"/>
+          </w:tcPr>
+          <w:p>
+            <w:r>
+              <w:t>Karen</w:t>
+            </w:r>
+          </w:p>
+        </w:tc>
+      </w:tr>
+      <w:tr>
+        <w:tc>
+          <w:tcPr>
+            <w:tcW w:w="3000" w:type="dxa"/>
+            <w:shd w:val="clear" w:color="auto" w:fill="F2F2F2"/>
+          </w:tcPr>
+          <w:p>
+            <w:r>
+              <w:rPr>
+                <w:b/>
+                <w:bCs/>
+              </w:rPr>
+              <w:t>Usuario de GitHub:</w:t>
+            </w:r>
+          </w:p>
+        </w:tc>
+        <w:tc>
+          <w:tcPr>
+            <w:tcW w:w="6500" w:type="dxa"/>
+          </w:tcPr>
+          <w:p>
+            <w:r>
+              <w:t>KYMUELAS</w:t>
+            </w:r>
+          </w:p>
+        </w:tc>
+      </w:tr>
+      <w:tr>
+        <w:tc>
+          <w:tcPr>
+            <w:tcW w:w="3000" w:type="dxa"/>
+            <w:shd w:val="clear" w:color="auto" w:fill="F2F2F2"/>
+          </w:tcPr>
+          <w:p>
+            <w:r>
+              <w:rPr>
+                <w:b/>
+                <w:bCs/>
+              </w:rPr>
+              <w:t>Repositorio:</w:t>
+            </w:r>
+          </w:p>
+        </w:tc>
+        <w:tc>
+          <w:tcPr>
+            <w:tcW w:w="6500" w:type="dxa"/>
+          </w:tcPr>
+          <w:p>
+            <w:proofErr w:type="spellStart"/>
+            <w:r>
+              <w:t>evaluacionGit</w:t>
+            </w:r>
+            <w:proofErr w:type="spellEnd"/>
+            <w:r>
+              <w:t>-</w:t>
+            </w:r>
+          </w:p>
+        </w:tc>
+      </w:tr>
+    </w:tbl>
+    <w:p>
+      <w:pPr>
+        <w:spacing w:after="300"/>
+      </w:pPr>
+    </w:p>
+    <w:p>
+      <w:pPr>
+        <w:pStyle w:val="Ttulo1"/>
+        <w:spacing w:before="300" w:after="150"/>
+      </w:pPr>
+      <w:r>
+        <w:t>1. Propósito de este documento</w:t>
+      </w:r>
+    </w:p>
+    <w:p>
+      <w:pPr>
+        <w:spacing w:after="120"/>
+      </w:pPr>
+      <w:r>
+        <w:t xml:space="preserve">Este documento describe el esqueleto inicial de microservicios definido para el sistema de información de una EPS, tal como fue creado en la rama </w:t>
+      </w:r>
+      <w:proofErr w:type="spellStart"/>
+      <w:r>
+        <w:t>main</w:t>
+      </w:r>
+      <w:proofErr w:type="spellEnd"/>
+      <w:r>
+        <w:t xml:space="preserve"> del repositorio </w:t>
+      </w:r>
+      <w:proofErr w:type="spellStart"/>
+      <w:r>
+        <w:t>evaluacionGit</w:t>
+      </w:r>
+      <w:proofErr w:type="spellEnd"/>
+      <w:r>
+        <w:t>-. En esta etapa cada microservicio existe únicamente como una carpeta con un archivo mínimo (index.js), sin lógica de negocio implementada; su propósito es dejar establecida la división de responsabilidades del sistema antes de avanzar en el desarrollo.</w:t>
+      </w:r>
+    </w:p>
+    <w:p>
+      <w:pPr>
+        <w:spacing w:after="120"/>
+      </w:pPr>
+      <w:r>
+        <w:t xml:space="preserve">La explicación detallada de la arquitectura (comunicación entre servicios, patrones aplicados y diagrama) se encuentra por separado en </w:t>
+      </w:r>
+      <w:proofErr w:type="spellStart"/>
+      <w:r>
+        <w:t>Docs</w:t>
+      </w:r>
+      <w:proofErr w:type="spellEnd"/>
+      <w:r>
+        <w:t>/Arquitectura_EPS.docx, disponible únicamente en la rama desarrollo.</w:t>
+      </w:r>
+    </w:p>
+    <w:p>
+      <w:pPr>
+        <w:pStyle w:val="Ttulo1"/>
+        <w:spacing w:before="300" w:after="150"/>
+      </w:pPr>
+      <w:r>
+        <w:t>2. Estructura de carpetas creada</w:t>
+      </w:r>
+    </w:p>
+    <w:p>
+      <w:pPr>
+        <w:spacing w:after="120"/>
+      </w:pPr>
+      <w:r>
+        <w:t xml:space="preserve">Dentro de la carpeta </w:t>
+      </w:r>
+      <w:proofErr w:type="spellStart"/>
+      <w:r>
+        <w:t>eps</w:t>
+      </w:r>
+      <w:proofErr w:type="spellEnd"/>
+      <w:r>
+        <w:t>-microservicios/ se crearon las siguientes carpetas, una por cada microservicio identificado:</w:t>
+      </w:r>
+    </w:p>
+    <w:p>
+      <w:proofErr w:type="spellStart"/>
+      <w:r>
+        <w:rPr>
+          <w:rFonts w:ascii="Consolas" w:eastAsia="Consolas" w:hAnsi="Consolas" w:cs="Consolas"/>
+        </w:rPr>
+        <w:t>eps</w:t>
+      </w:r>
+      <w:proofErr w:type="spellEnd"/>
+      <w:r>
+        <w:rPr>
+          <w:rFonts w:ascii="Consolas" w:eastAsia="Consolas" w:hAnsi="Consolas" w:cs="Consolas"/>
+        </w:rPr>
+        <w:t>-microservicios/</w:t>
+      </w:r>
+    </w:p>
+    <w:p>
+      <w:r>
+        <w:rPr>
+          <w:rFonts w:ascii="Consolas" w:eastAsia="Consolas" w:hAnsi="Consolas" w:cs="Consolas"/>
+        </w:rPr>
+        <w:t>├── api-</w:t>
+      </w:r>
+      <w:proofErr w:type="spellStart"/>
+      <w:r>
+        <w:rPr>
+          <w:rFonts w:ascii="Consolas" w:eastAsia="Consolas" w:hAnsi="Consolas" w:cs="Consolas"/>
+        </w:rPr>
+        <w:t>gateway</w:t>
+      </w:r>
+      <w:proofErr w:type="spellEnd"/>
+      <w:r>
+        <w:rPr>
+          <w:rFonts w:ascii="Consolas" w:eastAsia="Consolas" w:hAnsi="Consolas" w:cs="Consolas"/>
+        </w:rPr>
+        <w:t>/</w:t>
+      </w:r>
+    </w:p>
+    <w:p>
+      <w:r>
+        <w:rPr>
+          <w:rFonts w:ascii="Consolas" w:eastAsia="Consolas" w:hAnsi="Consolas" w:cs="Consolas"/>
+        </w:rPr>
+        <w:t>├── microservicio-afiliaciones/</w:t>
+      </w:r>
+    </w:p>
+    <w:p>
+      <w:r>
+        <w:rPr>
+          <w:rFonts w:ascii="Consolas" w:eastAsia="Consolas" w:hAnsi="Consolas" w:cs="Consolas"/>
+        </w:rPr>
+        <w:t>├── microservicio-citas/</w:t>
+      </w:r>
+    </w:p>
+    <w:p>
+      <w:r>
+        <w:rPr>
+          <w:rFonts w:ascii="Consolas" w:eastAsia="Consolas" w:hAnsi="Consolas" w:cs="Consolas"/>
+        </w:rPr>
+        <w:t>├── microservicio-autorizaciones/</w:t>
+      </w:r>
+    </w:p>
+    <w:p>
+      <w:r>
+        <w:rPr>
+          <w:rFonts w:ascii="Consolas" w:eastAsia="Consolas" w:hAnsi="Consolas" w:cs="Consolas"/>
+        </w:rPr>
+        <w:t>├── microservicio-</w:t>
+      </w:r>
+      <w:proofErr w:type="spellStart"/>
+      <w:r>
+        <w:rPr>
+          <w:rFonts w:ascii="Consolas" w:eastAsia="Consolas" w:hAnsi="Consolas" w:cs="Consolas"/>
+        </w:rPr>
+        <w:t>facturacion</w:t>
+      </w:r>
+      <w:proofErr w:type="spellEnd"/>
+      <w:r>
+        <w:rPr>
+          <w:rFonts w:ascii="Consolas" w:eastAsia="Consolas" w:hAnsi="Consolas" w:cs="Consolas"/>
+        </w:rPr>
+        <w:t>/</w:t>
+      </w:r>
+    </w:p>
+    <w:p>
+      <w:r>
+        <w:rPr>
+          <w:rFonts w:ascii="Consolas" w:eastAsia="Consolas" w:hAnsi="Consolas" w:cs="Consolas"/>
+        </w:rPr>
+        <w:t>└── microservicio-historias-</w:t>
+      </w:r>
+      <w:proofErr w:type="spellStart"/>
+      <w:r>
+        <w:rPr>
+          <w:rFonts w:ascii="Consolas" w:eastAsia="Consolas" w:hAnsi="Consolas" w:cs="Consolas"/>
+        </w:rPr>
+        <w:t>clinicas</w:t>
+      </w:r>
+      <w:proofErr w:type="spellEnd"/>
+      <w:r>
+        <w:rPr>
+          <w:rFonts w:ascii="Consolas" w:eastAsia="Consolas" w:hAnsi="Consolas" w:cs="Consolas"/>
+        </w:rPr>
+        <w:t>/</w:t>
+      </w:r>
+    </w:p>
+    <w:p>
+      <w:pPr>
+        <w:spacing w:after="200"/>
+      </w:pPr>
+    </w:p>
+    <w:p>
+      <w:pPr>
+        <w:spacing w:after="120"/>
+      </w:pPr>
+      <w:r>
+        <w:t>Cada una de estas carpetas contiene por ahora un único archivo index.js con una línea de comentario que identifica el microservicio, únicamente para que la carpeta no quede vacía (Git no versiona carpetas vacías).</w:t>
+      </w:r>
+    </w:p>
+    <w:p>
+      <w:pPr>
+        <w:pStyle w:val="Ttulo1"/>
+        <w:spacing w:before="300" w:after="150"/>
+      </w:pPr>
+      <w:r>
+        <w:t>3. Descripción de cada microservicio</w:t>
+      </w:r>
+    </w:p>
+    <w:tbl>
+      <w:tblPr>
+        <w:tblW w:w="5000" w:type="pct"/>
+        <w:tblBorders>
+          <w:top w:val="single" w:sz="4" w:space="0" w:color="auto"/>
+          <w:left w:val="single" w:sz="4" w:space="0" w:color="auto"/>
+          <w:bottom w:val="single" w:sz="4" w:space="0" w:color="auto"/>
+          <w:right w:val="single" w:sz="4" w:space="0" w:color="auto"/>
+          <w:insideH w:val="single" w:sz="4" w:space="0" w:color="auto"/>
+          <w:insideV w:val="single" w:sz="4" w:space="0" w:color="auto"/>
+        </w:tblBorders>
+        <w:tblCellMar>
+          <w:left w:w="10" w:type="dxa"/>
+          <w:right w:w="10" w:type="dxa"/>
+        </w:tblCellMar>
+        <w:tblLook w:val="0000" w:firstRow="0" w:lastRow="0" w:firstColumn="0" w:lastColumn="0" w:noHBand="0" w:noVBand="0"/>
+      </w:tblPr>
+      <w:tblGrid>
+        <w:gridCol w:w="2706"/>
+        <w:gridCol w:w="6644"/>
+      </w:tblGrid>
+      <w:tr>
+        <w:tc>
+          <w:tcPr>
+            <w:tcW w:w="0" w:type="auto"/>
+            <w:shd w:val="clear" w:color="auto" w:fill="1F4E79"/>
+          </w:tcPr>
+          <w:p>
+            <w:r>
+              <w:rPr>
+                <w:b/>
+                <w:bCs/>
+                <w:color w:val="FFFFFF"/>
+              </w:rPr>
+              <w:lastRenderedPageBreak/>
+              <w:t>Carpeta / Microservicio</w:t>
+            </w:r>
+          </w:p>
+        </w:tc>
+        <w:tc>
+          <w:tcPr>
+            <w:tcW w:w="0" w:type="auto"/>
+            <w:shd w:val="clear" w:color="auto" w:fill="1F4E79"/>
+          </w:tcPr>
+          <w:p>
+            <w:r>
+              <w:rPr>
+                <w:b/>
+                <w:bCs/>
+                <w:color w:val="FFFFFF"/>
+              </w:rPr>
+              <w:t>Responsabilidad</w:t>
+            </w:r>
+          </w:p>
+        </w:tc>
+      </w:tr>
+      <w:tr>
+        <w:tc>
+          <w:tcPr>
+            <w:tcW w:w="0" w:type="auto"/>
+          </w:tcPr>
+          <w:p>
+            <w:r>
+              <w:rPr>
+                <w:rFonts w:ascii="Consolas" w:eastAsia="Consolas" w:hAnsi="Consolas" w:cs="Consolas"/>
+              </w:rPr>
+              <w:t>api-</w:t>
+            </w:r>
+            <w:proofErr w:type="spellStart"/>
+            <w:r>
+              <w:rPr>
+                <w:rFonts w:ascii="Consolas" w:eastAsia="Consolas" w:hAnsi="Consolas" w:cs="Consolas"/>
+              </w:rPr>
+              <w:t>gateway</w:t>
+            </w:r>
+            <w:proofErr w:type="spellEnd"/>
+          </w:p>
+        </w:tc>
+        <w:tc>
+          <w:tcPr>
+            <w:tcW w:w="0" w:type="auto"/>
+          </w:tcPr>
+          <w:p>
+            <w:r>
+              <w:t>Punto único de entrada del sistema. Enruta cada petición del cliente al microservicio correspondiente y centraliza la autenticación.</w:t>
+            </w:r>
+          </w:p>
+        </w:tc>
+      </w:tr>
+      <w:tr>
+        <w:tc>
+          <w:tcPr>
+            <w:tcW w:w="0" w:type="auto"/>
+          </w:tcPr>
+          <w:p>
+            <w:r>
+              <w:rPr>
+                <w:rFonts w:ascii="Consolas" w:eastAsia="Consolas" w:hAnsi="Consolas" w:cs="Consolas"/>
+              </w:rPr>
+              <w:t>microservicio-afiliaciones</w:t>
+            </w:r>
+          </w:p>
+        </w:tc>
+        <w:tc>
+          <w:tcPr>
+            <w:tcW w:w="0" w:type="auto"/>
+          </w:tcPr>
+          <w:p>
+            <w:r>
+              <w:t>Administra los datos de afiliación y demográficos de cada paciente de la EPS.</w:t>
+            </w:r>
+          </w:p>
+        </w:tc>
+      </w:tr>
+      <w:tr>
+        <w:tc>
+          <w:tcPr>
+            <w:tcW w:w="0" w:type="auto"/>
+          </w:tcPr>
+          <w:p>
+            <w:r>
+              <w:rPr>
+                <w:rFonts w:ascii="Consolas" w:eastAsia="Consolas" w:hAnsi="Consolas" w:cs="Consolas"/>
+              </w:rPr>
+              <w:t>microservicio-citas</w:t>
+            </w:r>
+          </w:p>
+        </w:tc>
+        <w:tc>
+          <w:tcPr>
+            <w:tcW w:w="0" w:type="auto"/>
+          </w:tcPr>
+          <w:p>
+            <w:r>
+              <w:t>Gestiona el agendamiento, reprogramación y cancelación de citas médicas.</w:t>
+            </w:r>
+          </w:p>
+        </w:tc>
+      </w:tr>
+      <w:tr>
+        <w:tc>
+          <w:tcPr>
+            <w:tcW w:w="0" w:type="auto"/>
+          </w:tcPr>
+          <w:p>
+            <w:r>
+              <w:rPr>
+                <w:rFonts w:ascii="Consolas" w:eastAsia="Consolas" w:hAnsi="Consolas" w:cs="Consolas"/>
+              </w:rPr>
+              <w:t>microservicio-autorizaciones</w:t>
+            </w:r>
+          </w:p>
+        </w:tc>
+        <w:tc>
+          <w:tcPr>
+            <w:tcW w:w="0" w:type="auto"/>
+          </w:tcPr>
+          <w:p>
+            <w:r>
+              <w:t>Evalúa y emite autorizaciones de procedimientos y servicios médicos según el plan del afiliado.</w:t>
+            </w:r>
+          </w:p>
+        </w:tc>
+      </w:tr>
+      <w:tr>
+        <w:tc>
+          <w:tcPr>
+            <w:tcW w:w="0" w:type="auto"/>
+          </w:tcPr>
+          <w:p>
+            <w:r>
+              <w:rPr>
+                <w:rFonts w:ascii="Consolas" w:eastAsia="Consolas" w:hAnsi="Consolas" w:cs="Consolas"/>
+              </w:rPr>
+              <w:t>microservicio-</w:t>
+            </w:r>
+            <w:proofErr w:type="spellStart"/>
+            <w:r>
+              <w:rPr>
+                <w:rFonts w:ascii="Consolas" w:eastAsia="Consolas" w:hAnsi="Consolas" w:cs="Consolas"/>
+              </w:rPr>
+              <w:t>facturacion</w:t>
+            </w:r>
+            <w:proofErr w:type="spellEnd"/>
+          </w:p>
+        </w:tc>
+        <w:tc>
+          <w:tcPr>
+            <w:tcW w:w="0" w:type="auto"/>
+          </w:tcPr>
+          <w:p>
+            <w:r>
+              <w:t>Procesa cobros, copagos y liquidaciones asociadas a los servicios prestados.</w:t>
+            </w:r>
+          </w:p>
+        </w:tc>
+      </w:tr>
+      <w:tr>
+        <w:tc>
+          <w:tcPr>
+            <w:tcW w:w="0" w:type="auto"/>
+          </w:tcPr>
+          <w:p>
+            <w:r>
+              <w:rPr>
+                <w:rFonts w:ascii="Consolas" w:eastAsia="Consolas" w:hAnsi="Consolas" w:cs="Consolas"/>
+              </w:rPr>
+              <w:t>microservicio-historias-</w:t>
+            </w:r>
+            <w:proofErr w:type="spellStart"/>
+            <w:r>
+              <w:rPr>
+                <w:rFonts w:ascii="Consolas" w:eastAsia="Consolas" w:hAnsi="Consolas" w:cs="Consolas"/>
+              </w:rPr>
+              <w:t>clinicas</w:t>
+            </w:r>
+            <w:proofErr w:type="spellEnd"/>
+          </w:p>
+        </w:tc>
+        <w:tc>
+          <w:tcPr>
+            <w:tcW w:w="0" w:type="auto"/>
+          </w:tcPr>
+          <w:p>
+            <w:r>
+              <w:t>Registra diagnósticos, tratamientos y evolución médica de cada paciente.</w:t>
+            </w:r>
+          </w:p>
+        </w:tc>
+      </w:tr>
+    </w:tbl>
+    <w:p>
+      <w:pPr>
+        <w:spacing w:after="200"/>
+      </w:pPr>
+    </w:p>
+    <w:p>
+      <w:pPr>
+        <w:pStyle w:val="Ttulo1"/>
+        <w:spacing w:before="300" w:after="150"/>
+      </w:pPr>
+      <w:r>
+        <w:t>4. Justificación de la división</w:t>
+      </w:r>
+    </w:p>
+    <w:p>
+      <w:pPr>
+        <w:spacing w:after="120"/>
+      </w:pPr>
+      <w:r>
+        <w:t>La estructura se dividió en microservicios independientes siguiendo el principio de un dominio de negocio por servicio:</w:t>
+      </w:r>
+    </w:p>
+    <w:p>
+      <w:pPr>
+        <w:pStyle w:val="Prrafodelista"/>
+        <w:numPr>
+          <w:ilvl w:val="0"/>
+          <w:numId w:val="3"/>
+        </w:numPr>
+        <w:spacing w:after="60"/>
+        <w:contextualSpacing w:val="0"/>
+      </w:pPr>
+      <w:r>
+        <w:t>Cada microservicio agrupa una responsabilidad concreta de la EPS (afiliaciones, citas, autorizaciones, facturación, historias clínicas), evitando construir una única aplicación monolítica.</w:t>
+      </w:r>
+    </w:p>
+    <w:p>
+      <w:pPr>
+        <w:pStyle w:val="Prrafodelista"/>
+        <w:numPr>
+          <w:ilvl w:val="0"/>
+          <w:numId w:val="3"/>
+        </w:numPr>
+        <w:spacing w:after="60"/>
+        <w:contextualSpacing w:val="0"/>
+      </w:pPr>
+      <w:r>
+        <w:t>El api-</w:t>
+      </w:r>
+      <w:proofErr w:type="spellStart"/>
+      <w:r>
+        <w:t>gateway</w:t>
+      </w:r>
+      <w:proofErr w:type="spellEnd"/>
+      <w:r>
+        <w:t xml:space="preserve"> centraliza el punto de entrada, de modo que el cliente no necesita conocer la ubicación de cada microservicio por separado.</w:t>
+      </w:r>
+    </w:p>
+    <w:p>
+      <w:pPr>
+        <w:pStyle w:val="Prrafodelista"/>
+        <w:numPr>
+          <w:ilvl w:val="0"/>
+          <w:numId w:val="3"/>
+        </w:numPr>
+        <w:spacing w:after="60"/>
+        <w:contextualSpacing w:val="0"/>
+      </w:pPr>
+      <w:r>
+        <w:t>Esta separación permite que, en una fase posterior de desarrollo, cada microservicio pueda evolucionar, desplegarse y escalar de forma independiente.</w:t>
+      </w:r>
+    </w:p>
+    <w:p>
+      <w:pPr>
+        <w:pStyle w:val="Ttulo1"/>
+        <w:spacing w:before="300" w:after="150"/>
+      </w:pPr>
+      <w:r>
+        <w:t>5. Estado de esta entrega</w:t>
+      </w:r>
+    </w:p>
+    <w:p>
+      <w:pPr>
+        <w:spacing w:after="120"/>
+      </w:pPr>
+      <w:r>
+        <w:t xml:space="preserve">Esta estructura corresponde a la rama </w:t>
+      </w:r>
+      <w:proofErr w:type="spellStart"/>
+      <w:r>
+        <w:t>main</w:t>
+      </w:r>
+      <w:proofErr w:type="spellEnd"/>
+      <w:r>
+        <w:t xml:space="preserve"> del repositorio y se mantiene igual en las ramas desarrollo y pruebas, ya que representa la base común del proyecto. Lo que varía entre ramas es el contenido adicional (</w:t>
+      </w:r>
+      <w:proofErr w:type="spellStart"/>
+      <w:r>
+        <w:t>Docs</w:t>
+      </w:r>
+      <w:proofErr w:type="spellEnd"/>
+      <w:r>
+        <w:t xml:space="preserve">/ solo en desarrollo; </w:t>
+      </w:r>
+      <w:proofErr w:type="spellStart"/>
+      <w:r>
+        <w:t>Algoritmos_pruebas</w:t>
+      </w:r>
+      <w:proofErr w:type="spellEnd"/>
+      <w:r>
+        <w:t xml:space="preserve">/ en desarrollo y pruebas, no en </w:t>
+      </w:r>
+      <w:proofErr w:type="spellStart"/>
+      <w:r>
+        <w:t>main</w:t>
+      </w:r>
+      <w:proofErr w:type="spellEnd"/>
+      <w:r>
+        <w:t>), conforme a la estructura esperada definida en el taller.</w:t>
+      </w:r>
+    </w:p>
+    <w:p/>
     <w:p/>
     <w:sectPr>
-      <w:pgSz w:w="12240" w:h="15840" w:code="1"/>
-      <w:pgMar w:top="1440" w:right="1440" w:bottom="1440" w:left="1440" w:header="709" w:footer="709" w:gutter="0"/>
-      <w:cols w:space="708"/>
+      <w:pgSz w:w="12240" w:h="15840"/>
+      <w:pgMar w:top="1440" w:right="1440" w:bottom="1440" w:left="1440" w:header="708" w:footer="708" w:gutter="0"/>
+      <w:cols w:space="720"/>
       <w:docGrid w:linePitch="360"/>
     </w:sectPr>
   </w:body>
@@ -129,6 +1632,92 @@
     </w:lvl>
   </w:abstractNum>
   <w:abstractNum w:abstractNumId="1" w15:restartNumberingAfterBreak="0">
+    <w:nsid w:val="65EE1E1E"/>
+    <w:multiLevelType w:val="hybridMultilevel"/>
+    <w:tmpl w:val="5D2CDBFA"/>
+    <w:lvl w:ilvl="0" w:tplc="9E1C4746">
+      <w:start w:val="1"/>
+      <w:numFmt w:val="bullet"/>
+      <w:lvlText w:val="●"/>
+      <w:lvlJc w:val="left"/>
+      <w:pPr>
+        <w:ind w:left="720" w:hanging="360"/>
+      </w:pPr>
+    </w:lvl>
+    <w:lvl w:ilvl="1" w:tplc="DB24B556">
+      <w:start w:val="1"/>
+      <w:numFmt w:val="bullet"/>
+      <w:lvlText w:val="○"/>
+      <w:lvlJc w:val="left"/>
+      <w:pPr>
+        <w:ind w:left="1440" w:hanging="360"/>
+      </w:pPr>
+    </w:lvl>
+    <w:lvl w:ilvl="2" w:tplc="599C17A0">
+      <w:start w:val="1"/>
+      <w:numFmt w:val="bullet"/>
+      <w:lvlText w:val="■"/>
+      <w:lvlJc w:val="left"/>
+      <w:pPr>
+        <w:ind w:left="2160" w:hanging="360"/>
+      </w:pPr>
+    </w:lvl>
+    <w:lvl w:ilvl="3" w:tplc="D13C8C64">
+      <w:start w:val="1"/>
+      <w:numFmt w:val="bullet"/>
+      <w:lvlText w:val="●"/>
+      <w:lvlJc w:val="left"/>
+      <w:pPr>
+        <w:ind w:left="2880" w:hanging="360"/>
+      </w:pPr>
+    </w:lvl>
+    <w:lvl w:ilvl="4" w:tplc="5F083546">
+      <w:start w:val="1"/>
+      <w:numFmt w:val="bullet"/>
+      <w:lvlText w:val="○"/>
+      <w:lvlJc w:val="left"/>
+      <w:pPr>
+        <w:ind w:left="3600" w:hanging="360"/>
+      </w:pPr>
+    </w:lvl>
+    <w:lvl w:ilvl="5" w:tplc="4A86867C">
+      <w:start w:val="1"/>
+      <w:numFmt w:val="bullet"/>
+      <w:lvlText w:val="■"/>
+      <w:lvlJc w:val="left"/>
+      <w:pPr>
+        <w:ind w:left="4320" w:hanging="360"/>
+      </w:pPr>
+    </w:lvl>
+    <w:lvl w:ilvl="6" w:tplc="A47249D0">
+      <w:start w:val="1"/>
+      <w:numFmt w:val="bullet"/>
+      <w:lvlText w:val="●"/>
+      <w:lvlJc w:val="left"/>
+      <w:pPr>
+        <w:ind w:left="5040" w:hanging="360"/>
+      </w:pPr>
+    </w:lvl>
+    <w:lvl w:ilvl="7" w:tplc="0D746258">
+      <w:start w:val="1"/>
+      <w:numFmt w:val="bullet"/>
+      <w:lvlText w:val="●"/>
+      <w:lvlJc w:val="left"/>
+      <w:pPr>
+        <w:ind w:left="5760" w:hanging="360"/>
+      </w:pPr>
+    </w:lvl>
+    <w:lvl w:ilvl="8" w:tplc="592AFF00">
+      <w:start w:val="1"/>
+      <w:numFmt w:val="bullet"/>
+      <w:lvlText w:val="●"/>
+      <w:lvlJc w:val="left"/>
+      <w:pPr>
+        <w:ind w:left="6480" w:hanging="360"/>
+      </w:pPr>
+    </w:lvl>
+  </w:abstractNum>
+  <w:abstractNum w:abstractNumId="2" w15:restartNumberingAfterBreak="0">
     <w:nsid w:val="7DF747B9"/>
     <w:multiLevelType w:val="hybridMultilevel"/>
     <w:tmpl w:val="D1589EC0"/>
@@ -215,10 +1804,16 @@
     </w:lvl>
   </w:abstractNum>
   <w:num w:numId="1" w16cid:durableId="1981301816">
-    <w:abstractNumId w:val="1"/>
+    <w:abstractNumId w:val="2"/>
   </w:num>
   <w:num w:numId="2" w16cid:durableId="247464035">
     <w:abstractNumId w:val="0"/>
+  </w:num>
+  <w:num w:numId="3" w16cid:durableId="1083844558">
+    <w:abstractNumId w:val="1"/>
+    <w:lvlOverride w:ilvl="0">
+      <w:startOverride w:val="1"/>
+    </w:lvlOverride>
   </w:num>
 </w:numbering>
 </file>
@@ -422,7 +2017,7 @@
     <w:lsdException w:name="Medium Shading 2 Accent 1" w:uiPriority="64"/>
     <w:lsdException w:name="Medium List 1 Accent 1" w:uiPriority="65"/>
     <w:lsdException w:name="Revision" w:semiHidden="1"/>
-    <w:lsdException w:name="List Paragraph" w:uiPriority="34" w:qFormat="1"/>
+    <w:lsdException w:name="List Paragraph" w:uiPriority="0" w:qFormat="1"/>
     <w:lsdException w:name="Quote" w:uiPriority="29" w:qFormat="1"/>
     <w:lsdException w:name="Intense Quote" w:uiPriority="30" w:qFormat="1"/>
     <w:lsdException w:name="Medium List 2 Accent 1" w:uiPriority="66"/>
@@ -623,9 +2218,17 @@
   <w:style w:type="paragraph" w:default="1" w:styleId="Normal">
     <w:name w:val="Normal"/>
     <w:qFormat/>
-    <w:rsid w:val="005C03C9"/>
-    <w:rPr>
-      <w:rFonts w:ascii="Times New Roman" w:hAnsi="Times New Roman"/>
+    <w:rsid w:val="00936590"/>
+    <w:pPr>
+      <w:spacing w:after="0" w:line="240" w:lineRule="auto"/>
+    </w:pPr>
+    <w:rPr>
+      <w:rFonts w:ascii="Times New Roman" w:eastAsia="Times New Roman" w:hAnsi="Times New Roman" w:cs="Times New Roman"/>
+      <w:kern w:val="0"/>
+      <w:sz w:val="20"/>
+      <w:szCs w:val="20"/>
+      <w:lang w:eastAsia="es-CO"/>
+      <w14:ligatures w14:val="none"/>
     </w:rPr>
   </w:style>
   <w:style w:type="paragraph" w:styleId="Ttulo1">
@@ -638,16 +2241,14 @@
     <w:qFormat/>
     <w:rsid w:val="009265EA"/>
     <w:pPr>
-      <w:spacing w:after="0" w:line="360" w:lineRule="auto"/>
+      <w:spacing w:line="360" w:lineRule="auto"/>
       <w:ind w:firstLine="708"/>
       <w:jc w:val="center"/>
       <w:outlineLvl w:val="0"/>
     </w:pPr>
     <w:rPr>
-      <w:rFonts w:eastAsia="Calibri" w:cs="Times New Roman"/>
+      <w:rFonts w:eastAsia="Calibri"/>
       <w:b/>
-      <w:kern w:val="0"/>
-      <w14:ligatures w14:val="none"/>
     </w:rPr>
   </w:style>
   <w:style w:type="paragraph" w:styleId="Ttulo2">
@@ -685,11 +2286,9 @@
       <w:outlineLvl w:val="2"/>
     </w:pPr>
     <w:rPr>
-      <w:rFonts w:eastAsia="Calibri" w:cs="Times New Roman"/>
+      <w:rFonts w:eastAsia="Calibri"/>
       <w:b/>
-      <w:kern w:val="0"/>
       <w:szCs w:val="22"/>
-      <w14:ligatures w14:val="none"/>
     </w:rPr>
   </w:style>
   <w:style w:type="paragraph" w:styleId="Ttulo4">
@@ -749,7 +2348,7 @@
     <w:pPr>
       <w:keepNext/>
       <w:keepLines/>
-      <w:spacing w:before="40" w:after="0"/>
+      <w:spacing w:before="40"/>
       <w:outlineLvl w:val="5"/>
     </w:pPr>
     <w:rPr>
@@ -772,7 +2371,7 @@
     <w:pPr>
       <w:keepNext/>
       <w:keepLines/>
-      <w:spacing w:before="40" w:after="0"/>
+      <w:spacing w:before="40"/>
       <w:outlineLvl w:val="6"/>
     </w:pPr>
     <w:rPr>
@@ -793,7 +2392,6 @@
     <w:pPr>
       <w:keepNext/>
       <w:keepLines/>
-      <w:spacing w:after="0"/>
       <w:outlineLvl w:val="7"/>
     </w:pPr>
     <w:rPr>
@@ -816,7 +2414,6 @@
     <w:pPr>
       <w:keepNext/>
       <w:keepLines/>
-      <w:spacing w:after="0"/>
       <w:outlineLvl w:val="8"/>
     </w:pPr>
     <w:rPr>
@@ -827,7 +2424,6 @@
   <w:style w:type="character" w:default="1" w:styleId="Fuentedeprrafopredeter">
     <w:name w:val="Default Paragraph Font"/>
     <w:uiPriority w:val="1"/>
-    <w:semiHidden/>
     <w:unhideWhenUsed/>
   </w:style>
   <w:style w:type="table" w:default="1" w:styleId="Tablanormal">
@@ -921,9 +2517,7 @@
       <w:jc w:val="both"/>
     </w:pPr>
     <w:rPr>
-      <w:rFonts w:eastAsia="Calibri" w:cs="Times New Roman"/>
-      <w:kern w:val="0"/>
-      <w14:ligatures w14:val="none"/>
+      <w:rFonts w:eastAsia="Calibri"/>
     </w:rPr>
   </w:style>
   <w:style w:type="character" w:customStyle="1" w:styleId="APANormalCar">
@@ -1055,7 +2649,7 @@
     <w:qFormat/>
     <w:rsid w:val="009E0A33"/>
     <w:pPr>
-      <w:spacing w:after="80" w:line="240" w:lineRule="auto"/>
+      <w:spacing w:after="80"/>
       <w:contextualSpacing/>
     </w:pPr>
     <w:rPr>
@@ -1149,7 +2743,6 @@
   <w:style w:type="paragraph" w:styleId="Prrafodelista">
     <w:name w:val="List Paragraph"/>
     <w:basedOn w:val="Normal"/>
-    <w:uiPriority w:val="34"/>
     <w:qFormat/>
     <w:rsid w:val="009E0A33"/>
     <w:pPr>

</xml_diff>